<commit_message>
feat: adiciona conteudo sobre estimativas e arredondamento no Modulo 1 da apostila de Matematica
Co-Authored-By: Claude Sonnet 4.6 <noreply@anthropic.com>
</commit_message>
<xml_diff>
--- a/sistema/FICHA-PRODUTO-MAIS-TECH/ReforcoMatematicaRaciocinioLogico/Apostila_Reforco_Matematica_Raciocinio_Logico.docx
+++ b/sistema/FICHA-PRODUTO-MAIS-TECH/ReforcoMatematicaRaciocinioLogico/Apostila_Reforco_Matematica_Raciocinio_Logico.docx
@@ -2744,7 +2744,7 @@
           <w:sz w:val="30"/>
           <w:szCs w:val="30"/>
         </w:rPr>
-        <w:t xml:space="preserve">Encontro 4 — Cálculo Mental e Problemas Cotidianos (2h)</w:t>
+        <w:t xml:space="preserve">Encontro 4 — Cálculo Mental, Estimativas e Problemas Cotidianos (2h)</w:t>
       </w:r>
     </w:p>
     <w:p>
@@ -2807,27 +2807,6 @@
     </w:p>
     <w:p>
       <w:pPr>
-        <w:spacing w:after="80" w:before="80"/>
-      </w:pPr>
-      <w:r>
-        <w:rPr>
-          <w:b/>
-          <w:bCs/>
-          <w:sz w:val="22"/>
-          <w:szCs w:val="22"/>
-        </w:rPr>
-        <w:t xml:space="preserve">Estimativas:</w:t>
-      </w:r>
-      <w:r>
-        <w:rPr>
-          <w:sz w:val="22"/>
-          <w:szCs w:val="22"/>
-        </w:rPr>
-        <w:t xml:space="preserve"> Para verificar se o resultado faz sentido, arredonde os valores antes de calcular.</w:t>
-      </w:r>
-    </w:p>
-    <w:p>
-      <w:pPr>
         <w:pStyle w:val="Heading3"/>
         <w:spacing w:after="120" w:before="240"/>
       </w:pPr>
@@ -2839,33 +2818,184 @@
           <w:sz w:val="25"/>
           <w:szCs w:val="25"/>
         </w:rPr>
-        <w:t xml:space="preserve">4.2 Problemas Contextualizados</w:t>
-      </w:r>
-    </w:p>
-    <w:p>
-      <w:pPr>
-        <w:spacing w:after="80" w:before="80"/>
-      </w:pPr>
-      <w:r>
-        <w:rPr>
-          <w:b/>
-          <w:bCs/>
-          <w:sz w:val="22"/>
-          <w:szCs w:val="22"/>
-        </w:rPr>
-        <w:t xml:space="preserve">Exemplo 15 — Cotidiano:</w:t>
-      </w:r>
-    </w:p>
-    <w:p>
-      <w:pPr>
-        <w:spacing w:after="80" w:before="80"/>
-      </w:pPr>
-      <w:r>
-        <w:rPr>
-          <w:sz w:val="22"/>
-          <w:szCs w:val="22"/>
-        </w:rPr>
-        <w:t xml:space="preserve">Lucas foi ao supermercado e comprou: refrigerante (R$ 8,50), pão (R$ 4,20), queijo (R$ 12,80) e iogurte (R$ 6,00). Pagou com R$ 50,00. Qual o troco?</w:t>
+        <w:t xml:space="preserve">4.2 Estimativas e Arredondamento</w:t>
+      </w:r>
+    </w:p>
+    <w:p>
+      <w:pPr>
+        <w:spacing w:after="80" w:before="80"/>
+      </w:pPr>
+      <w:r>
+        <w:rPr>
+          <w:sz w:val="22"/>
+          <w:szCs w:val="22"/>
+        </w:rPr>
+        <w:t xml:space="preserve">Estimar significa obter uma resposta aproximada — rápida e suficientemente próxima para verificar se um resultado é razoável. Usamos estimativas antes de calcular para saber se o resultado final "faz sentido".</w:t>
+      </w:r>
+    </w:p>
+    <w:p>
+      <w:pPr>
+        <w:spacing w:after="80" w:before="80"/>
+      </w:pPr>
+      <w:r>
+        <w:rPr>
+          <w:b/>
+          <w:bCs/>
+          <w:sz w:val="22"/>
+          <w:szCs w:val="22"/>
+        </w:rPr>
+        <w:t xml:space="preserve">Regras de arredondamento:</w:t>
+      </w:r>
+    </w:p>
+    <w:p>
+      <w:pPr>
+        <w:pStyle w:val="ListParagraph"/>
+        <w:numPr>
+          <w:ilvl w:val="0"/>
+          <w:numId w:val="2"/>
+        </w:numPr>
+        <w:spacing w:after="60" w:before="60"/>
+      </w:pPr>
+      <w:r>
+        <w:rPr>
+          <w:sz w:val="22"/>
+          <w:szCs w:val="22"/>
+        </w:rPr>
+        <w:t xml:space="preserve">Identifique a casa que quer arredondar (dezena, centena, milhar...)</w:t>
+      </w:r>
+    </w:p>
+    <w:p>
+      <w:pPr>
+        <w:pStyle w:val="ListParagraph"/>
+        <w:numPr>
+          <w:ilvl w:val="0"/>
+          <w:numId w:val="2"/>
+        </w:numPr>
+        <w:spacing w:after="60" w:before="60"/>
+      </w:pPr>
+      <w:r>
+        <w:rPr>
+          <w:sz w:val="22"/>
+          <w:szCs w:val="22"/>
+        </w:rPr>
+        <w:t xml:space="preserve">Olhe o dígito à </w:t>
+      </w:r>
+      <w:r>
+        <w:rPr>
+          <w:b/>
+          <w:bCs/>
+          <w:sz w:val="22"/>
+          <w:szCs w:val="22"/>
+        </w:rPr>
+        <w:t xml:space="preserve">direita</w:t>
+      </w:r>
+      <w:r>
+        <w:rPr>
+          <w:sz w:val="22"/>
+          <w:szCs w:val="22"/>
+        </w:rPr>
+        <w:t xml:space="preserve"> dessa casa</w:t>
+      </w:r>
+    </w:p>
+    <w:p>
+      <w:pPr>
+        <w:pStyle w:val="ListParagraph"/>
+        <w:numPr>
+          <w:ilvl w:val="0"/>
+          <w:numId w:val="2"/>
+        </w:numPr>
+        <w:spacing w:after="60" w:before="60"/>
+      </w:pPr>
+      <w:r>
+        <w:rPr>
+          <w:sz w:val="22"/>
+          <w:szCs w:val="22"/>
+        </w:rPr>
+        <w:t xml:space="preserve">Se for </w:t>
+      </w:r>
+      <w:r>
+        <w:rPr>
+          <w:b/>
+          <w:bCs/>
+          <w:sz w:val="22"/>
+          <w:szCs w:val="22"/>
+        </w:rPr>
+        <w:t xml:space="preserve">≥ 5</w:t>
+      </w:r>
+      <w:r>
+        <w:rPr>
+          <w:sz w:val="22"/>
+          <w:szCs w:val="22"/>
+        </w:rPr>
+        <w:t xml:space="preserve"> → arredonde para cima</w:t>
+      </w:r>
+    </w:p>
+    <w:p>
+      <w:pPr>
+        <w:pStyle w:val="ListParagraph"/>
+        <w:numPr>
+          <w:ilvl w:val="0"/>
+          <w:numId w:val="2"/>
+        </w:numPr>
+        <w:spacing w:after="60" w:before="60"/>
+      </w:pPr>
+      <w:r>
+        <w:rPr>
+          <w:sz w:val="22"/>
+          <w:szCs w:val="22"/>
+        </w:rPr>
+        <w:t xml:space="preserve">Se for </w:t>
+      </w:r>
+      <w:r>
+        <w:rPr>
+          <w:b/>
+          <w:bCs/>
+          <w:sz w:val="22"/>
+          <w:szCs w:val="22"/>
+        </w:rPr>
+        <w:t xml:space="preserve">&lt; 5</w:t>
+      </w:r>
+      <w:r>
+        <w:rPr>
+          <w:sz w:val="22"/>
+          <w:szCs w:val="22"/>
+        </w:rPr>
+        <w:t xml:space="preserve"> → mantenha (arredonde para baixo)</w:t>
+      </w:r>
+    </w:p>
+    <w:p>
+      <w:pPr>
+        <w:spacing w:after="80" w:before="80"/>
+      </w:pPr>
+      <w:r>
+        <w:rPr>
+          <w:b/>
+          <w:bCs/>
+          <w:sz w:val="22"/>
+          <w:szCs w:val="22"/>
+        </w:rPr>
+        <w:t xml:space="preserve">Exemplos resolvidos:</w:t>
+      </w:r>
+    </w:p>
+    <w:p>
+      <w:pPr>
+        <w:spacing w:after="80" w:before="80"/>
+      </w:pPr>
+      <w:r>
+        <w:rPr>
+          <w:b/>
+          <w:bCs/>
+          <w:sz w:val="22"/>
+          <w:szCs w:val="22"/>
+        </w:rPr>
+        <w:t xml:space="preserve">Exemplo 14a:</w:t>
+      </w:r>
+      <w:r>
+        <w:rPr>
+          <w:sz w:val="22"/>
+          <w:szCs w:val="22"/>
+        </w:rPr>
+        <w:t xml:space="preserve"> Arredonde 347 para a dezena mais próxima.</w:t>
       </w:r>
     </w:p>
     <w:p>
@@ -2881,7 +3011,37 @@
           <w:sz w:val="21"/>
           <w:szCs w:val="21"/>
         </w:rPr>
-        <w:t xml:space="preserve">Total das compras: 8,50 + 4,20 + 12,80 + 6,00 = 31,50</w:t>
+        <w:t xml:space="preserve">Dígito das unidades = 7 ≥ 5 → sobe → </w:t>
+      </w:r>
+      <w:r>
+        <w:rPr>
+          <w:b/>
+          <w:bCs/>
+          <w:sz w:val="21"/>
+          <w:szCs w:val="21"/>
+        </w:rPr>
+        <w:t xml:space="preserve">350</w:t>
+      </w:r>
+    </w:p>
+    <w:p>
+      <w:pPr>
+        <w:spacing w:after="80" w:before="80"/>
+      </w:pPr>
+      <w:r>
+        <w:rPr>
+          <w:b/>
+          <w:bCs/>
+          <w:sz w:val="22"/>
+          <w:szCs w:val="22"/>
+        </w:rPr>
+        <w:t xml:space="preserve">Exemplo 14b:</w:t>
+      </w:r>
+      <w:r>
+        <w:rPr>
+          <w:sz w:val="22"/>
+          <w:szCs w:val="22"/>
+        </w:rPr>
+        <w:t xml:space="preserve"> Arredonde 2.648 para a centena mais próxima.</w:t>
       </w:r>
     </w:p>
     <w:p>
@@ -2897,42 +3057,37 @@
           <w:sz w:val="21"/>
           <w:szCs w:val="21"/>
         </w:rPr>
-        <w:t xml:space="preserve">Troco: 50,00 - 31,50 = </w:t>
-      </w:r>
-      <w:r>
-        <w:rPr>
-          <w:b/>
-          <w:bCs/>
-          <w:sz w:val="21"/>
-          <w:szCs w:val="21"/>
-        </w:rPr>
-        <w:t xml:space="preserve">R$ 18,50</w:t>
-      </w:r>
-    </w:p>
-    <w:p>
-      <w:pPr>
-        <w:spacing w:after="80" w:before="80"/>
-      </w:pPr>
-      <w:r>
-        <w:rPr>
-          <w:b/>
-          <w:bCs/>
-          <w:sz w:val="22"/>
-          <w:szCs w:val="22"/>
-        </w:rPr>
-        <w:t xml:space="preserve">Exemplo 16 — Tecnologia:</w:t>
-      </w:r>
-    </w:p>
-    <w:p>
-      <w:pPr>
-        <w:spacing w:after="80" w:before="80"/>
-      </w:pPr>
-      <w:r>
-        <w:rPr>
-          <w:sz w:val="22"/>
-          <w:szCs w:val="22"/>
-        </w:rPr>
-        <w:t xml:space="preserve">Uma internet de 100 Mb/s transmite dados. Quantos segundos leva para baixar um arquivo de 600 Mb?</w:t>
+        <w:t xml:space="preserve">Dígito das dezenas = 4 &lt; 5 → mantém → </w:t>
+      </w:r>
+      <w:r>
+        <w:rPr>
+          <w:b/>
+          <w:bCs/>
+          <w:sz w:val="21"/>
+          <w:szCs w:val="21"/>
+        </w:rPr>
+        <w:t xml:space="preserve">2.600</w:t>
+      </w:r>
+    </w:p>
+    <w:p>
+      <w:pPr>
+        <w:spacing w:after="80" w:before="80"/>
+      </w:pPr>
+      <w:r>
+        <w:rPr>
+          <w:b/>
+          <w:bCs/>
+          <w:sz w:val="22"/>
+          <w:szCs w:val="22"/>
+        </w:rPr>
+        <w:t xml:space="preserve">Exemplo 14c:</w:t>
+      </w:r>
+      <w:r>
+        <w:rPr>
+          <w:sz w:val="22"/>
+          <w:szCs w:val="22"/>
+        </w:rPr>
+        <w:t xml:space="preserve"> Arredonde 8.950 para o milhar mais próximo.</w:t>
       </w:r>
     </w:p>
     <w:p>
@@ -2948,16 +3103,182 @@
           <w:sz w:val="21"/>
           <w:szCs w:val="21"/>
         </w:rPr>
-        <w:t xml:space="preserve">600 ÷ 100 = </w:t>
-      </w:r>
-      <w:r>
-        <w:rPr>
-          <w:b/>
-          <w:bCs/>
-          <w:sz w:val="21"/>
-          <w:szCs w:val="21"/>
-        </w:rPr>
-        <w:t xml:space="preserve">6 segundos</w:t>
+        <w:t xml:space="preserve">Dígito das centenas = 9 ≥ 5 → sobe → </w:t>
+      </w:r>
+      <w:r>
+        <w:rPr>
+          <w:b/>
+          <w:bCs/>
+          <w:sz w:val="21"/>
+          <w:szCs w:val="21"/>
+        </w:rPr>
+        <w:t xml:space="preserve">9.000</w:t>
+      </w:r>
+    </w:p>
+    <w:p>
+      <w:pPr>
+        <w:spacing w:after="80" w:before="80"/>
+      </w:pPr>
+      <w:r>
+        <w:rPr>
+          <w:b/>
+          <w:bCs/>
+          <w:sz w:val="22"/>
+          <w:szCs w:val="22"/>
+        </w:rPr>
+        <w:t xml:space="preserve">Estimativa antes de calcular:</w:t>
+      </w:r>
+    </w:p>
+    <w:p>
+      <w:pPr>
+        <w:spacing w:after="80" w:before="80"/>
+      </w:pPr>
+      <w:r>
+        <w:rPr>
+          <w:b/>
+          <w:bCs/>
+          <w:sz w:val="22"/>
+          <w:szCs w:val="22"/>
+        </w:rPr>
+        <w:t xml:space="preserve">Exemplo 14d:</w:t>
+      </w:r>
+      <w:r>
+        <w:rPr>
+          <w:sz w:val="22"/>
+          <w:szCs w:val="22"/>
+        </w:rPr>
+        <w:t xml:space="preserve"> Calcule 48 × 21 — primeiro estime, depois calcule o exato.</w:t>
+      </w:r>
+    </w:p>
+    <w:p>
+      <w:pPr>
+        <w:pBdr>
+          <w:left w:val="single" w:color="E53935" w:sz="12"/>
+        </w:pBdr>
+        <w:spacing w:after="60" w:before="60"/>
+        <w:ind w:left="720"/>
+      </w:pPr>
+      <w:r>
+        <w:rPr>
+          <w:sz w:val="21"/>
+          <w:szCs w:val="21"/>
+        </w:rPr>
+        <w:t xml:space="preserve">Estimativa: 50 × 20 = </w:t>
+      </w:r>
+      <w:r>
+        <w:rPr>
+          <w:b/>
+          <w:bCs/>
+          <w:sz w:val="21"/>
+          <w:szCs w:val="21"/>
+        </w:rPr>
+        <w:t xml:space="preserve">1.000</w:t>
+      </w:r>
+    </w:p>
+    <w:p>
+      <w:pPr>
+        <w:pBdr>
+          <w:left w:val="single" w:color="E53935" w:sz="12"/>
+        </w:pBdr>
+        <w:spacing w:after="60" w:before="60"/>
+        <w:ind w:left="720"/>
+      </w:pPr>
+      <w:r>
+        <w:rPr>
+          <w:sz w:val="21"/>
+          <w:szCs w:val="21"/>
+        </w:rPr>
+        <w:t xml:space="preserve">Resultado exato: 48 × 21 = </w:t>
+      </w:r>
+      <w:r>
+        <w:rPr>
+          <w:b/>
+          <w:bCs/>
+          <w:sz w:val="21"/>
+          <w:szCs w:val="21"/>
+        </w:rPr>
+        <w:t xml:space="preserve">1.008</w:t>
+      </w:r>
+      <w:r>
+        <w:rPr>
+          <w:sz w:val="21"/>
+          <w:szCs w:val="21"/>
+        </w:rPr>
+        <w:t xml:space="preserve"> ✓ (próximo da estimativa — faz sentido!)</w:t>
+      </w:r>
+    </w:p>
+    <w:p>
+      <w:pPr>
+        <w:spacing w:after="80" w:before="80"/>
+      </w:pPr>
+      <w:r>
+        <w:rPr>
+          <w:b/>
+          <w:bCs/>
+          <w:sz w:val="22"/>
+          <w:szCs w:val="22"/>
+        </w:rPr>
+        <w:t xml:space="preserve">Exemplo 14e — Cotidiano:</w:t>
+      </w:r>
+    </w:p>
+    <w:p>
+      <w:pPr>
+        <w:spacing w:after="80" w:before="80"/>
+      </w:pPr>
+      <w:r>
+        <w:rPr>
+          <w:sz w:val="22"/>
+          <w:szCs w:val="22"/>
+        </w:rPr>
+        <w:t xml:space="preserve">Uma escola tem 23 turmas com 29 alunos cada. Quantos alunos ao todo (aproximadamente)?</w:t>
+      </w:r>
+    </w:p>
+    <w:p>
+      <w:pPr>
+        <w:pBdr>
+          <w:left w:val="single" w:color="E53935" w:sz="12"/>
+        </w:pBdr>
+        <w:spacing w:after="60" w:before="60"/>
+        <w:ind w:left="720"/>
+      </w:pPr>
+      <w:r>
+        <w:rPr>
+          <w:sz w:val="21"/>
+          <w:szCs w:val="21"/>
+        </w:rPr>
+        <w:t xml:space="preserve">23 ≈ 20 e 29 ≈ 30 → 20 × 30 = </w:t>
+      </w:r>
+      <w:r>
+        <w:rPr>
+          <w:b/>
+          <w:bCs/>
+          <w:sz w:val="21"/>
+          <w:szCs w:val="21"/>
+        </w:rPr>
+        <w:t xml:space="preserve">600 alunos</w:t>
+      </w:r>
+      <w:r>
+        <w:rPr>
+          <w:sz w:val="21"/>
+          <w:szCs w:val="21"/>
+        </w:rPr>
+        <w:t xml:space="preserve"> (estimativa rápida)</w:t>
+      </w:r>
+    </w:p>
+    <w:p>
+      <w:pPr>
+        <w:pBdr>
+          <w:left w:val="single" w:color="E53935" w:sz="12"/>
+        </w:pBdr>
+        <w:spacing w:after="60" w:before="60"/>
+        <w:ind w:left="720"/>
+      </w:pPr>
+      <w:r>
+        <w:rPr>
+          <w:sz w:val="21"/>
+          <w:szCs w:val="21"/>
+        </w:rPr>
+        <w:t xml:space="preserve">Exato: 23 × 29 = 667 alunos ✓</w:t>
       </w:r>
     </w:p>
     <w:p>
@@ -2973,7 +3294,254 @@
           <w:sz w:val="25"/>
           <w:szCs w:val="25"/>
         </w:rPr>
-        <w:t xml:space="preserve">Atividade 1.4 — Em Grupo (Desafio)</w:t>
+        <w:t xml:space="preserve">4.3 Problemas Contextualizados</w:t>
+      </w:r>
+    </w:p>
+    <w:p>
+      <w:pPr>
+        <w:spacing w:after="80" w:before="80"/>
+      </w:pPr>
+      <w:r>
+        <w:rPr>
+          <w:b/>
+          <w:bCs/>
+          <w:sz w:val="22"/>
+          <w:szCs w:val="22"/>
+        </w:rPr>
+        <w:t xml:space="preserve">Exemplo 15 — Cotidiano:</w:t>
+      </w:r>
+    </w:p>
+    <w:p>
+      <w:pPr>
+        <w:spacing w:after="80" w:before="80"/>
+      </w:pPr>
+      <w:r>
+        <w:rPr>
+          <w:sz w:val="22"/>
+          <w:szCs w:val="22"/>
+        </w:rPr>
+        <w:t xml:space="preserve">Lucas foi ao supermercado e comprou: refrigerante (R$ 8,50), pão (R$ 4,20), queijo (R$ 12,80) e iogurte (R$ 6,00). Pagou com R$ 50,00. Qual o troco?</w:t>
+      </w:r>
+    </w:p>
+    <w:p>
+      <w:pPr>
+        <w:pBdr>
+          <w:left w:val="single" w:color="E53935" w:sz="12"/>
+        </w:pBdr>
+        <w:spacing w:after="60" w:before="60"/>
+        <w:ind w:left="720"/>
+      </w:pPr>
+      <w:r>
+        <w:rPr>
+          <w:sz w:val="21"/>
+          <w:szCs w:val="21"/>
+        </w:rPr>
+        <w:t xml:space="preserve">Total das compras: 8,50 + 4,20 + 12,80 + 6,00 = 31,50</w:t>
+      </w:r>
+    </w:p>
+    <w:p>
+      <w:pPr>
+        <w:pBdr>
+          <w:left w:val="single" w:color="E53935" w:sz="12"/>
+        </w:pBdr>
+        <w:spacing w:after="60" w:before="60"/>
+        <w:ind w:left="720"/>
+      </w:pPr>
+      <w:r>
+        <w:rPr>
+          <w:sz w:val="21"/>
+          <w:szCs w:val="21"/>
+        </w:rPr>
+        <w:t xml:space="preserve">Troco: 50,00 - 31,50 = </w:t>
+      </w:r>
+      <w:r>
+        <w:rPr>
+          <w:b/>
+          <w:bCs/>
+          <w:sz w:val="21"/>
+          <w:szCs w:val="21"/>
+        </w:rPr>
+        <w:t xml:space="preserve">R$ 18,50</w:t>
+      </w:r>
+    </w:p>
+    <w:p>
+      <w:pPr>
+        <w:spacing w:after="80" w:before="80"/>
+      </w:pPr>
+      <w:r>
+        <w:rPr>
+          <w:b/>
+          <w:bCs/>
+          <w:sz w:val="22"/>
+          <w:szCs w:val="22"/>
+        </w:rPr>
+        <w:t xml:space="preserve">Exemplo 16 — Tecnologia:</w:t>
+      </w:r>
+    </w:p>
+    <w:p>
+      <w:pPr>
+        <w:spacing w:after="80" w:before="80"/>
+      </w:pPr>
+      <w:r>
+        <w:rPr>
+          <w:sz w:val="22"/>
+          <w:szCs w:val="22"/>
+        </w:rPr>
+        <w:t xml:space="preserve">Uma internet de 100 Mb/s transmite dados. Quantos segundos leva para baixar um arquivo de 600 Mb?</w:t>
+      </w:r>
+    </w:p>
+    <w:p>
+      <w:pPr>
+        <w:pBdr>
+          <w:left w:val="single" w:color="E53935" w:sz="12"/>
+        </w:pBdr>
+        <w:spacing w:after="60" w:before="60"/>
+        <w:ind w:left="720"/>
+      </w:pPr>
+      <w:r>
+        <w:rPr>
+          <w:sz w:val="21"/>
+          <w:szCs w:val="21"/>
+        </w:rPr>
+        <w:t xml:space="preserve">600 ÷ 100 = </w:t>
+      </w:r>
+      <w:r>
+        <w:rPr>
+          <w:b/>
+          <w:bCs/>
+          <w:sz w:val="21"/>
+          <w:szCs w:val="21"/>
+        </w:rPr>
+        <w:t xml:space="preserve">6 segundos</w:t>
+      </w:r>
+    </w:p>
+    <w:p>
+      <w:pPr>
+        <w:pStyle w:val="Heading3"/>
+        <w:spacing w:after="120" w:before="240"/>
+      </w:pPr>
+      <w:r>
+        <w:rPr>
+          <w:rFonts w:ascii="Calibri" w:cs="Calibri" w:eastAsia="Calibri" w:hAnsi="Calibri"/>
+          <w:b/>
+          <w:bCs/>
+          <w:sz w:val="25"/>
+          <w:szCs w:val="25"/>
+        </w:rPr>
+        <w:t xml:space="preserve">Atividade 1.4 — Individual (Estimativas)</w:t>
+      </w:r>
+    </w:p>
+    <w:p>
+      <w:pPr>
+        <w:spacing w:after="80" w:before="80"/>
+      </w:pPr>
+      <w:r>
+        <w:rPr>
+          <w:sz w:val="22"/>
+          <w:szCs w:val="22"/>
+        </w:rPr>
+        <w:t xml:space="preserve">Arredonde e estime:</w:t>
+      </w:r>
+    </w:p>
+    <w:p>
+      <w:pPr>
+        <w:pStyle w:val="ListParagraph"/>
+        <w:numPr>
+          <w:ilvl w:val="0"/>
+          <w:numId w:val="3"/>
+        </w:numPr>
+        <w:spacing w:after="60" w:before="60"/>
+      </w:pPr>
+      <w:r>
+        <w:rPr>
+          <w:sz w:val="22"/>
+          <w:szCs w:val="22"/>
+        </w:rPr>
+        <w:t xml:space="preserve">Arredonde 563 para a dezena → ___; para a centena → ___</w:t>
+      </w:r>
+    </w:p>
+    <w:p>
+      <w:pPr>
+        <w:pStyle w:val="ListParagraph"/>
+        <w:numPr>
+          <w:ilvl w:val="0"/>
+          <w:numId w:val="3"/>
+        </w:numPr>
+        <w:spacing w:after="60" w:before="60"/>
+      </w:pPr>
+      <w:r>
+        <w:rPr>
+          <w:sz w:val="22"/>
+          <w:szCs w:val="22"/>
+        </w:rPr>
+        <w:t xml:space="preserve">Arredonde 4.847 para a centena → ___; para o milhar → ___</w:t>
+      </w:r>
+    </w:p>
+    <w:p>
+      <w:pPr>
+        <w:pStyle w:val="ListParagraph"/>
+        <w:numPr>
+          <w:ilvl w:val="0"/>
+          <w:numId w:val="3"/>
+        </w:numPr>
+        <w:spacing w:after="60" w:before="60"/>
+      </w:pPr>
+      <w:r>
+        <w:rPr>
+          <w:sz w:val="22"/>
+          <w:szCs w:val="22"/>
+        </w:rPr>
+        <w:t xml:space="preserve">Estime 39 × 51 arredondando para a dezena mais próxima. Depois calcule o resultado exato.</w:t>
+      </w:r>
+    </w:p>
+    <w:p>
+      <w:pPr>
+        <w:pStyle w:val="ListParagraph"/>
+        <w:numPr>
+          <w:ilvl w:val="0"/>
+          <w:numId w:val="3"/>
+        </w:numPr>
+        <w:spacing w:after="60" w:before="60"/>
+      </w:pPr>
+      <w:r>
+        <w:rPr>
+          <w:sz w:val="22"/>
+          <w:szCs w:val="22"/>
+        </w:rPr>
+        <w:t xml:space="preserve">Uma loja vendeu 198 produtos a R$ 31,00 cada. Estime o total. Depois calcule o exato.</w:t>
+      </w:r>
+    </w:p>
+    <w:p>
+      <w:pPr>
+        <w:pStyle w:val="ListParagraph"/>
+        <w:numPr>
+          <w:ilvl w:val="0"/>
+          <w:numId w:val="3"/>
+        </w:numPr>
+        <w:spacing w:after="60" w:before="60"/>
+      </w:pPr>
+      <w:r>
+        <w:rPr>
+          <w:sz w:val="22"/>
+          <w:szCs w:val="22"/>
+        </w:rPr>
+        <w:t xml:space="preserve">Você tem R$ 47,00. Pode comprar um item de R$ 19,90 e outro de R$ 28,50? Estime antes de calcular para decidir rapidamente.</w:t>
+      </w:r>
+    </w:p>
+    <w:p>
+      <w:pPr>
+        <w:pStyle w:val="Heading3"/>
+        <w:spacing w:after="120" w:before="240"/>
+      </w:pPr>
+      <w:r>
+        <w:rPr>
+          <w:rFonts w:ascii="Calibri" w:cs="Calibri" w:eastAsia="Calibri" w:hAnsi="Calibri"/>
+          <w:b/>
+          <w:bCs/>
+          <w:sz w:val="25"/>
+          <w:szCs w:val="25"/>
+        </w:rPr>
+        <w:t xml:space="preserve">Atividade 1.5 — Em Grupo (Desafio)</w:t>
       </w:r>
     </w:p>
     <w:p>
@@ -3132,6 +3700,18 @@
           <w:szCs w:val="22"/>
         </w:rPr>
         <w:t xml:space="preserve">| Cálculo mental | Decomposição e compensação |</w:t>
+      </w:r>
+    </w:p>
+    <w:p>
+      <w:pPr>
+        <w:spacing w:after="80" w:before="80"/>
+      </w:pPr>
+      <w:r>
+        <w:rPr>
+          <w:sz w:val="22"/>
+          <w:szCs w:val="22"/>
+        </w:rPr>
+        <w:t xml:space="preserve">| Estimativas | Arredondar (≥5 sobe, &lt;5 mantém) e verificar se o resultado é razoável |</w:t>
       </w:r>
     </w:p>
     <w:p>
@@ -16352,6 +16932,132 @@
           <w:szCs w:val="22"/>
         </w:rPr>
         <w:t xml:space="preserve">Atividade 1.4</w:t>
+      </w:r>
+    </w:p>
+    <w:p>
+      <w:pPr>
+        <w:pStyle w:val="ListParagraph"/>
+        <w:numPr>
+          <w:ilvl w:val="0"/>
+          <w:numId w:val="3"/>
+        </w:numPr>
+        <w:spacing w:after="60" w:before="60"/>
+      </w:pPr>
+      <w:r>
+        <w:rPr>
+          <w:sz w:val="22"/>
+          <w:szCs w:val="22"/>
+        </w:rPr>
+        <w:t xml:space="preserve">Dezena: 560; Centena: 600</w:t>
+      </w:r>
+    </w:p>
+    <w:p>
+      <w:pPr>
+        <w:pStyle w:val="ListParagraph"/>
+        <w:numPr>
+          <w:ilvl w:val="0"/>
+          <w:numId w:val="3"/>
+        </w:numPr>
+        <w:spacing w:after="60" w:before="60"/>
+      </w:pPr>
+      <w:r>
+        <w:rPr>
+          <w:sz w:val="22"/>
+          <w:szCs w:val="22"/>
+        </w:rPr>
+        <w:t xml:space="preserve">Centena: 4.800; Milhar: 5.000</w:t>
+      </w:r>
+    </w:p>
+    <w:p>
+      <w:pPr>
+        <w:pStyle w:val="ListParagraph"/>
+        <w:numPr>
+          <w:ilvl w:val="0"/>
+          <w:numId w:val="3"/>
+        </w:numPr>
+        <w:spacing w:after="60" w:before="60"/>
+      </w:pPr>
+      <w:r>
+        <w:rPr>
+          <w:sz w:val="22"/>
+          <w:szCs w:val="22"/>
+        </w:rPr>
+        <w:t xml:space="preserve">Estimativa: 40 × 50 = 2.000; Exato: 39 × 51 = </w:t>
+      </w:r>
+      <w:r>
+        <w:rPr>
+          <w:b/>
+          <w:bCs/>
+          <w:sz w:val="22"/>
+          <w:szCs w:val="22"/>
+        </w:rPr>
+        <w:t xml:space="preserve">1.989</w:t>
+      </w:r>
+    </w:p>
+    <w:p>
+      <w:pPr>
+        <w:pStyle w:val="ListParagraph"/>
+        <w:numPr>
+          <w:ilvl w:val="0"/>
+          <w:numId w:val="3"/>
+        </w:numPr>
+        <w:spacing w:after="60" w:before="60"/>
+      </w:pPr>
+      <w:r>
+        <w:rPr>
+          <w:sz w:val="22"/>
+          <w:szCs w:val="22"/>
+        </w:rPr>
+        <w:t xml:space="preserve">Estimativa: 200 × 30 = R$ 6.000,00; Exato: 198 × 31 = </w:t>
+      </w:r>
+      <w:r>
+        <w:rPr>
+          <w:b/>
+          <w:bCs/>
+          <w:sz w:val="22"/>
+          <w:szCs w:val="22"/>
+        </w:rPr>
+        <w:t xml:space="preserve">R$ 6.138,00</w:t>
+      </w:r>
+    </w:p>
+    <w:p>
+      <w:pPr>
+        <w:pStyle w:val="ListParagraph"/>
+        <w:numPr>
+          <w:ilvl w:val="0"/>
+          <w:numId w:val="3"/>
+        </w:numPr>
+        <w:spacing w:after="60" w:before="60"/>
+      </w:pPr>
+      <w:r>
+        <w:rPr>
+          <w:sz w:val="22"/>
+          <w:szCs w:val="22"/>
+        </w:rPr>
+        <w:t xml:space="preserve">Estimativa: 20 + 30 = R$ 50,00 &gt; R$ 47,00 → não dá; Exato: 19,90 + 28,50 = R$ 48,40 → </w:t>
+      </w:r>
+      <w:r>
+        <w:rPr>
+          <w:b/>
+          <w:bCs/>
+          <w:sz w:val="22"/>
+          <w:szCs w:val="22"/>
+        </w:rPr>
+        <w:t xml:space="preserve">não é possível comprar os dois</w:t>
+      </w:r>
+    </w:p>
+    <w:p>
+      <w:pPr>
+        <w:spacing w:after="80" w:before="80"/>
+      </w:pPr>
+      <w:r>
+        <w:rPr>
+          <w:b/>
+          <w:bCs/>
+          <w:sz w:val="22"/>
+          <w:szCs w:val="22"/>
+        </w:rPr>
+        <w:t xml:space="preserve">Atividade 1.5</w:t>
       </w:r>
     </w:p>
     <w:p>

</xml_diff>